<commit_message>
Update progress summary with the simplified run's 80k full evaluation
Co-Authored-By: Claude Opus 5.5 <noreply@anthropic.com>
Claude-Session: https://claude.ai/code/session_01NgcV1jENFnxK8m6baL1np3
</commit_message>
<xml_diff>
--- a/docs/research_progress_summary.docx
+++ b/docs/research_progress_summary.docx
@@ -29,7 +29,7 @@
           <w:sz w:val="17"/>
           <w:szCs w:val="17"/>
         </w:rPr>
-        <w:t xml:space="preserve">屬性：Eyeglasses／Male／Young／Smiling／Bangs　|　單一 seed、500 張測試臉（除註明外）、edit scale 0.9　|　AccBoth ＝ 共識來源上兩個評審皆判成功</w:t>
+        <w:t xml:space="preserve">屬性：Eyeglasses／Male／Young／Smiling／Bangs　|　單一 seed、500 張測試臉、edit scale 0.9　|　AccBoth ＝ 共識來源上兩個評審皆判成功</w:t>
       </w:r>
     </w:p>
     <w:p>
@@ -1599,6 +1599,113 @@
           </w:p>
         </w:tc>
       </w:tr>
+      <w:tr>
+        <w:trPr>
+          <w:cantSplit/>
+        </w:trPr>
+        <w:tc>
+          <w:tcPr>
+            <w:tcW w:type="dxa" w:w="3000"/>
+            <w:tcBorders>
+              <w:top w:val="single" w:color="BFBFBF" w:sz="4"/>
+              <w:left w:val="single" w:color="BFBFBF" w:sz="4"/>
+              <w:bottom w:val="single" w:color="BFBFBF" w:sz="4"/>
+              <w:right w:val="single" w:color="BFBFBF" w:sz="4"/>
+            </w:tcBorders>
+            <w:shd w:fill="F3F6FA" w:color="auto" w:val="clear"/>
+            <w:tcMar>
+              <w:top w:type="dxa" w:w="25"/>
+              <w:left w:type="dxa" w:w="70"/>
+              <w:bottom w:type="dxa" w:w="25"/>
+              <w:right w:type="dxa" w:w="70"/>
+            </w:tcMar>
+            <w:vAlign w:val="center"/>
+          </w:tcPr>
+          <w:p>
+            <w:pPr>
+              <w:spacing w:after="0" w:before="0" w:line="235"/>
+            </w:pPr>
+            <w:r>
+              <w:rPr>
+                <w:rFonts w:ascii="Calibri" w:cs="Calibri" w:eastAsia="Microsoft JhengHei" w:hAnsi="Calibri"/>
+                <w:b w:val="false"/>
+                <w:bCs w:val="false"/>
+                <w:sz w:val="19"/>
+                <w:szCs w:val="19"/>
+              </w:rPr>
+              <w:t xml:space="preserve">精簡版 80k</w:t>
+            </w:r>
+          </w:p>
+        </w:tc>
+        <w:tc>
+          <w:tcPr>
+            <w:tcW w:type="dxa" w:w="3300"/>
+            <w:tcBorders>
+              <w:top w:val="single" w:color="BFBFBF" w:sz="4"/>
+              <w:left w:val="single" w:color="BFBFBF" w:sz="4"/>
+              <w:bottom w:val="single" w:color="BFBFBF" w:sz="4"/>
+              <w:right w:val="single" w:color="BFBFBF" w:sz="4"/>
+            </w:tcBorders>
+            <w:shd w:fill="F3F6FA" w:color="auto" w:val="clear"/>
+            <w:tcMar>
+              <w:top w:type="dxa" w:w="25"/>
+              <w:left w:type="dxa" w:w="70"/>
+              <w:bottom w:type="dxa" w:w="25"/>
+              <w:right w:type="dxa" w:w="70"/>
+            </w:tcMar>
+            <w:vAlign w:val="center"/>
+          </w:tcPr>
+          <w:p>
+            <w:pPr>
+              <w:spacing w:after="0" w:before="0" w:line="235"/>
+            </w:pPr>
+            <w:r>
+              <w:rPr>
+                <w:rFonts w:ascii="Calibri" w:cs="Calibri" w:eastAsia="Microsoft JhengHei" w:hAnsi="Calibri"/>
+                <w:b w:val="false"/>
+                <w:bCs w:val="false"/>
+                <w:sz w:val="19"/>
+                <w:szCs w:val="19"/>
+              </w:rPr>
+              <w:t xml:space="preserve">0.34–0.55</w:t>
+            </w:r>
+          </w:p>
+        </w:tc>
+        <w:tc>
+          <w:tcPr>
+            <w:tcW w:type="dxa" w:w="3906"/>
+            <w:tcBorders>
+              <w:top w:val="single" w:color="BFBFBF" w:sz="4"/>
+              <w:left w:val="single" w:color="BFBFBF" w:sz="4"/>
+              <w:bottom w:val="single" w:color="BFBFBF" w:sz="4"/>
+              <w:right w:val="single" w:color="BFBFBF" w:sz="4"/>
+            </w:tcBorders>
+            <w:shd w:fill="F3F6FA" w:color="auto" w:val="clear"/>
+            <w:tcMar>
+              <w:top w:type="dxa" w:w="25"/>
+              <w:left w:type="dxa" w:w="70"/>
+              <w:bottom w:type="dxa" w:w="25"/>
+              <w:right w:type="dxa" w:w="70"/>
+            </w:tcMar>
+            <w:vAlign w:val="center"/>
+          </w:tcPr>
+          <w:p>
+            <w:pPr>
+              <w:spacing w:after="0" w:before="0" w:line="235"/>
+            </w:pPr>
+            <w:r>
+              <w:rPr>
+                <w:rFonts w:ascii="Calibri" w:cs="Calibri" w:eastAsia="Microsoft JhengHei" w:hAnsi="Calibri"/>
+                <w:b w:val="false"/>
+                <w:bCs w:val="false"/>
+                <w:sz w:val="19"/>
+                <w:szCs w:val="19"/>
+              </w:rPr>
+              <w:t xml:space="preserve">12–30%</w:t>
+            </w:r>
+          </w:p>
+        </w:tc>
+      </w:tr>
     </w:tbl>
     <w:p>
       <w:pPr>
@@ -1699,7 +1806,7 @@
           <w:sz w:val="24"/>
           <w:szCs w:val="24"/>
         </w:rPr>
-        <w:t xml:space="preserve">6. 精簡版（進行中）：dof、無 ControlNet、無 caps，其餘設定與 anneal 相同</w:t>
+        <w:t xml:space="preserve">6. 精簡版：dof、無 ControlNet、無 caps（其餘設定與 anneal 相同）</w:t>
       </w:r>
     </w:p>
     <w:p>
@@ -1712,7 +1819,7 @@
           <w:sz w:val="21"/>
           <w:szCs w:val="21"/>
         </w:rPr>
-        <w:t xml:space="preserve">70k 中途檢查（200 張臉），對照 anneal 70k 以相同設定評估。「相同 ID 差」依 anneal 80k 的 scale 掃描曲線估計，為近似值：</w:t>
+        <w:t xml:space="preserve">80k、500 張臉、scale 0.7–1.0 掃描；對照 anneal 80k（推論時同樣無 caps）。「相同 ID 的差」以 anneal 曲線線性內插，列出各 scale 的範圍：</w:t>
       </w:r>
     </w:p>
     <w:tbl>
@@ -1729,10 +1836,10 @@
       </w:tblPr>
       <w:tblGrid>
         <w:gridCol w:w="1700"/>
-        <w:gridCol w:w="2200"/>
-        <w:gridCol w:w="2200"/>
+        <w:gridCol w:w="2150"/>
+        <w:gridCol w:w="2150"/>
         <w:gridCol w:w="2400"/>
-        <w:gridCol w:w="1706"/>
+        <w:gridCol w:w="1806"/>
       </w:tblGrid>
       <w:tr>
         <w:trPr>
@@ -1775,7 +1882,7 @@
         </w:tc>
         <w:tc>
           <w:tcPr>
-            <w:tcW w:type="dxa" w:w="2200"/>
+            <w:tcW w:type="dxa" w:w="2150"/>
             <w:tcBorders>
               <w:top w:val="single" w:color="BFBFBF" w:sz="4"/>
               <w:left w:val="single" w:color="BFBFBF" w:sz="4"/>
@@ -1803,13 +1910,13 @@
                 <w:sz w:val="19"/>
                 <w:szCs w:val="19"/>
               </w:rPr>
-              <w:t xml:space="preserve">精簡版 Acc／ID</w:t>
-            </w:r>
-          </w:p>
-        </w:tc>
-        <w:tc>
-          <w:tcPr>
-            <w:tcW w:type="dxa" w:w="2200"/>
+              <w:t xml:space="preserve">精簡版 Acc／ID（0.9）</w:t>
+            </w:r>
+          </w:p>
+        </w:tc>
+        <w:tc>
+          <w:tcPr>
+            <w:tcW w:type="dxa" w:w="2150"/>
             <w:tcBorders>
               <w:top w:val="single" w:color="BFBFBF" w:sz="4"/>
               <w:left w:val="single" w:color="BFBFBF" w:sz="4"/>
@@ -1837,7 +1944,7 @@
                 <w:sz w:val="19"/>
                 <w:szCs w:val="19"/>
               </w:rPr>
-              <w:t xml:space="preserve">anneal Acc／ID</w:t>
+              <w:t xml:space="preserve">anneal Acc／ID（0.9）</w:t>
             </w:r>
           </w:p>
         </w:tc>
@@ -1871,13 +1978,13 @@
                 <w:sz w:val="19"/>
                 <w:szCs w:val="19"/>
               </w:rPr>
-              <w:t xml:space="preserve">相同 ID 的差（估計）</w:t>
-            </w:r>
-          </w:p>
-        </w:tc>
-        <w:tc>
-          <w:tcPr>
-            <w:tcW w:type="dxa" w:w="1706"/>
+              <w:t xml:space="preserve">相同 ID 的差（各 scale）</w:t>
+            </w:r>
+          </w:p>
+        </w:tc>
+        <w:tc>
+          <w:tcPr>
+            <w:tcW w:type="dxa" w:w="1806"/>
             <w:tcBorders>
               <w:top w:val="single" w:color="BFBFBF" w:sz="4"/>
               <w:left w:val="single" w:color="BFBFBF" w:sz="4"/>
@@ -1949,67 +2056,67 @@
         </w:tc>
         <w:tc>
           <w:tcPr>
-            <w:tcW w:type="dxa" w:w="2200"/>
-            <w:tcBorders>
-              <w:top w:val="single" w:color="BFBFBF" w:sz="4"/>
-              <w:left w:val="single" w:color="BFBFBF" w:sz="4"/>
-              <w:bottom w:val="single" w:color="BFBFBF" w:sz="4"/>
-              <w:right w:val="single" w:color="BFBFBF" w:sz="4"/>
-            </w:tcBorders>
-            <w:tcMar>
-              <w:top w:type="dxa" w:w="25"/>
-              <w:left w:type="dxa" w:w="70"/>
-              <w:bottom w:type="dxa" w:w="25"/>
-              <w:right w:type="dxa" w:w="70"/>
-            </w:tcMar>
-            <w:vAlign w:val="center"/>
-          </w:tcPr>
-          <w:p>
-            <w:pPr>
-              <w:spacing w:after="0" w:before="0" w:line="235"/>
-            </w:pPr>
-            <w:r>
-              <w:rPr>
-                <w:rFonts w:ascii="Calibri" w:cs="Calibri" w:eastAsia="Microsoft JhengHei" w:hAnsi="Calibri"/>
-                <w:b w:val="false"/>
-                <w:bCs w:val="false"/>
-                <w:sz w:val="19"/>
-                <w:szCs w:val="19"/>
-              </w:rPr>
-              <w:t xml:space="preserve">91.5 / .841</w:t>
-            </w:r>
-          </w:p>
-        </w:tc>
-        <w:tc>
-          <w:tcPr>
-            <w:tcW w:type="dxa" w:w="2200"/>
-            <w:tcBorders>
-              <w:top w:val="single" w:color="BFBFBF" w:sz="4"/>
-              <w:left w:val="single" w:color="BFBFBF" w:sz="4"/>
-              <w:bottom w:val="single" w:color="BFBFBF" w:sz="4"/>
-              <w:right w:val="single" w:color="BFBFBF" w:sz="4"/>
-            </w:tcBorders>
-            <w:tcMar>
-              <w:top w:type="dxa" w:w="25"/>
-              <w:left w:type="dxa" w:w="70"/>
-              <w:bottom w:type="dxa" w:w="25"/>
-              <w:right w:type="dxa" w:w="70"/>
-            </w:tcMar>
-            <w:vAlign w:val="center"/>
-          </w:tcPr>
-          <w:p>
-            <w:pPr>
-              <w:spacing w:after="0" w:before="0" w:line="235"/>
-            </w:pPr>
-            <w:r>
-              <w:rPr>
-                <w:rFonts w:ascii="Calibri" w:cs="Calibri" w:eastAsia="Microsoft JhengHei" w:hAnsi="Calibri"/>
-                <w:b w:val="false"/>
-                <w:bCs w:val="false"/>
-                <w:sz w:val="19"/>
-                <w:szCs w:val="19"/>
-              </w:rPr>
-              <w:t xml:space="preserve">87.5 / .849</w:t>
+            <w:tcW w:type="dxa" w:w="2150"/>
+            <w:tcBorders>
+              <w:top w:val="single" w:color="BFBFBF" w:sz="4"/>
+              <w:left w:val="single" w:color="BFBFBF" w:sz="4"/>
+              <w:bottom w:val="single" w:color="BFBFBF" w:sz="4"/>
+              <w:right w:val="single" w:color="BFBFBF" w:sz="4"/>
+            </w:tcBorders>
+            <w:tcMar>
+              <w:top w:type="dxa" w:w="25"/>
+              <w:left w:type="dxa" w:w="70"/>
+              <w:bottom w:type="dxa" w:w="25"/>
+              <w:right w:type="dxa" w:w="70"/>
+            </w:tcMar>
+            <w:vAlign w:val="center"/>
+          </w:tcPr>
+          <w:p>
+            <w:pPr>
+              <w:spacing w:after="0" w:before="0" w:line="235"/>
+            </w:pPr>
+            <w:r>
+              <w:rPr>
+                <w:rFonts w:ascii="Calibri" w:cs="Calibri" w:eastAsia="Microsoft JhengHei" w:hAnsi="Calibri"/>
+                <w:b w:val="false"/>
+                <w:bCs w:val="false"/>
+                <w:sz w:val="19"/>
+                <w:szCs w:val="19"/>
+              </w:rPr>
+              <w:t xml:space="preserve">92.0 / .834</w:t>
+            </w:r>
+          </w:p>
+        </w:tc>
+        <w:tc>
+          <w:tcPr>
+            <w:tcW w:type="dxa" w:w="2150"/>
+            <w:tcBorders>
+              <w:top w:val="single" w:color="BFBFBF" w:sz="4"/>
+              <w:left w:val="single" w:color="BFBFBF" w:sz="4"/>
+              <w:bottom w:val="single" w:color="BFBFBF" w:sz="4"/>
+              <w:right w:val="single" w:color="BFBFBF" w:sz="4"/>
+            </w:tcBorders>
+            <w:tcMar>
+              <w:top w:type="dxa" w:w="25"/>
+              <w:left w:type="dxa" w:w="70"/>
+              <w:bottom w:type="dxa" w:w="25"/>
+              <w:right w:type="dxa" w:w="70"/>
+            </w:tcMar>
+            <w:vAlign w:val="center"/>
+          </w:tcPr>
+          <w:p>
+            <w:pPr>
+              <w:spacing w:after="0" w:before="0" w:line="235"/>
+            </w:pPr>
+            <w:r>
+              <w:rPr>
+                <w:rFonts w:ascii="Calibri" w:cs="Calibri" w:eastAsia="Microsoft JhengHei" w:hAnsi="Calibri"/>
+                <w:b w:val="false"/>
+                <w:bCs w:val="false"/>
+                <w:sz w:val="19"/>
+                <w:szCs w:val="19"/>
+              </w:rPr>
+              <w:t xml:space="preserve">91.2 / .839</w:t>
             </w:r>
           </w:p>
         </w:tc>
@@ -2042,13 +2149,13 @@
                 <w:sz w:val="19"/>
                 <w:szCs w:val="19"/>
               </w:rPr>
-              <w:t xml:space="preserve">+0.5</w:t>
-            </w:r>
-          </w:p>
-        </w:tc>
-        <w:tc>
-          <w:tcPr>
-            <w:tcW w:type="dxa" w:w="1706"/>
+              <w:t xml:space="preserve">−0.6～−1.3</w:t>
+            </w:r>
+          </w:p>
+        </w:tc>
+        <w:tc>
+          <w:tcPr>
+            <w:tcW w:type="dxa" w:w="1806"/>
             <w:tcBorders>
               <w:top w:val="single" w:color="BFBFBF" w:sz="4"/>
               <w:left w:val="single" w:color="BFBFBF" w:sz="4"/>
@@ -2120,7 +2227,7 @@
         </w:tc>
         <w:tc>
           <w:tcPr>
-            <w:tcW w:type="dxa" w:w="2200"/>
+            <w:tcW w:type="dxa" w:w="2150"/>
             <w:tcBorders>
               <w:top w:val="single" w:color="BFBFBF" w:sz="4"/>
               <w:left w:val="single" w:color="BFBFBF" w:sz="4"/>
@@ -2148,13 +2255,13 @@
                 <w:sz w:val="19"/>
                 <w:szCs w:val="19"/>
               </w:rPr>
-              <w:t xml:space="preserve">74.4 / .803</w:t>
-            </w:r>
-          </w:p>
-        </w:tc>
-        <w:tc>
-          <w:tcPr>
-            <w:tcW w:type="dxa" w:w="2200"/>
+              <w:t xml:space="preserve">71.0 / .814</w:t>
+            </w:r>
+          </w:p>
+        </w:tc>
+        <w:tc>
+          <w:tcPr>
+            <w:tcW w:type="dxa" w:w="2150"/>
             <w:tcBorders>
               <w:top w:val="single" w:color="BFBFBF" w:sz="4"/>
               <w:left w:val="single" w:color="BFBFBF" w:sz="4"/>
@@ -2182,7 +2289,7 @@
                 <w:sz w:val="19"/>
                 <w:szCs w:val="19"/>
               </w:rPr>
-              <w:t xml:space="preserve">79.3 / .785</w:t>
+              <w:t xml:space="preserve">77.2 / .787</w:t>
             </w:r>
           </w:p>
         </w:tc>
@@ -2216,13 +2323,13 @@
                 <w:sz w:val="19"/>
                 <w:szCs w:val="19"/>
               </w:rPr>
-              <w:t xml:space="preserve">+0.4</w:t>
-            </w:r>
-          </w:p>
-        </w:tc>
-        <w:tc>
-          <w:tcPr>
-            <w:tcW w:type="dxa" w:w="1706"/>
+              <w:t xml:space="preserve">+3.4～+3.9</w:t>
+            </w:r>
+          </w:p>
+        </w:tc>
+        <w:tc>
+          <w:tcPr>
+            <w:tcW w:type="dxa" w:w="1806"/>
             <w:tcBorders>
               <w:top w:val="single" w:color="BFBFBF" w:sz="4"/>
               <w:left w:val="single" w:color="BFBFBF" w:sz="4"/>
@@ -2250,7 +2357,7 @@
                 <w:sz w:val="19"/>
                 <w:szCs w:val="19"/>
               </w:rPr>
-              <w:t xml:space="preserve">打平</w:t>
+              <w:t xml:space="preserve">打平（精簡版略好）</w:t>
             </w:r>
           </w:p>
         </w:tc>
@@ -2288,73 +2395,73 @@
                 <w:sz w:val="19"/>
                 <w:szCs w:val="19"/>
               </w:rPr>
-              <w:t xml:space="preserve">Smiling</w:t>
-            </w:r>
-          </w:p>
-        </w:tc>
-        <w:tc>
-          <w:tcPr>
-            <w:tcW w:type="dxa" w:w="2200"/>
-            <w:tcBorders>
-              <w:top w:val="single" w:color="BFBFBF" w:sz="4"/>
-              <w:left w:val="single" w:color="BFBFBF" w:sz="4"/>
-              <w:bottom w:val="single" w:color="BFBFBF" w:sz="4"/>
-              <w:right w:val="single" w:color="BFBFBF" w:sz="4"/>
-            </w:tcBorders>
-            <w:tcMar>
-              <w:top w:type="dxa" w:w="25"/>
-              <w:left w:type="dxa" w:w="70"/>
-              <w:bottom w:type="dxa" w:w="25"/>
-              <w:right w:type="dxa" w:w="70"/>
-            </w:tcMar>
-            <w:vAlign w:val="center"/>
-          </w:tcPr>
-          <w:p>
-            <w:pPr>
-              <w:spacing w:after="0" w:before="0" w:line="235"/>
-            </w:pPr>
-            <w:r>
-              <w:rPr>
-                <w:rFonts w:ascii="Calibri" w:cs="Calibri" w:eastAsia="Microsoft JhengHei" w:hAnsi="Calibri"/>
-                <w:b w:val="false"/>
-                <w:bCs w:val="false"/>
-                <w:sz w:val="19"/>
-                <w:szCs w:val="19"/>
-              </w:rPr>
-              <w:t xml:space="preserve">94.5 / .882</w:t>
-            </w:r>
-          </w:p>
-        </w:tc>
-        <w:tc>
-          <w:tcPr>
-            <w:tcW w:type="dxa" w:w="2200"/>
-            <w:tcBorders>
-              <w:top w:val="single" w:color="BFBFBF" w:sz="4"/>
-              <w:left w:val="single" w:color="BFBFBF" w:sz="4"/>
-              <w:bottom w:val="single" w:color="BFBFBF" w:sz="4"/>
-              <w:right w:val="single" w:color="BFBFBF" w:sz="4"/>
-            </w:tcBorders>
-            <w:tcMar>
-              <w:top w:type="dxa" w:w="25"/>
-              <w:left w:type="dxa" w:w="70"/>
-              <w:bottom w:type="dxa" w:w="25"/>
-              <w:right w:type="dxa" w:w="70"/>
-            </w:tcMar>
-            <w:vAlign w:val="center"/>
-          </w:tcPr>
-          <w:p>
-            <w:pPr>
-              <w:spacing w:after="0" w:before="0" w:line="235"/>
-            </w:pPr>
-            <w:r>
-              <w:rPr>
-                <w:rFonts w:ascii="Calibri" w:cs="Calibri" w:eastAsia="Microsoft JhengHei" w:hAnsi="Calibri"/>
-                <w:b w:val="false"/>
-                <w:bCs w:val="false"/>
-                <w:sz w:val="19"/>
-                <w:szCs w:val="19"/>
-              </w:rPr>
-              <w:t xml:space="preserve">94.5 / .884</w:t>
+              <w:t xml:space="preserve">Young</w:t>
+            </w:r>
+          </w:p>
+        </w:tc>
+        <w:tc>
+          <w:tcPr>
+            <w:tcW w:type="dxa" w:w="2150"/>
+            <w:tcBorders>
+              <w:top w:val="single" w:color="BFBFBF" w:sz="4"/>
+              <w:left w:val="single" w:color="BFBFBF" w:sz="4"/>
+              <w:bottom w:val="single" w:color="BFBFBF" w:sz="4"/>
+              <w:right w:val="single" w:color="BFBFBF" w:sz="4"/>
+            </w:tcBorders>
+            <w:tcMar>
+              <w:top w:type="dxa" w:w="25"/>
+              <w:left w:type="dxa" w:w="70"/>
+              <w:bottom w:type="dxa" w:w="25"/>
+              <w:right w:type="dxa" w:w="70"/>
+            </w:tcMar>
+            <w:vAlign w:val="center"/>
+          </w:tcPr>
+          <w:p>
+            <w:pPr>
+              <w:spacing w:after="0" w:before="0" w:line="235"/>
+            </w:pPr>
+            <w:r>
+              <w:rPr>
+                <w:rFonts w:ascii="Calibri" w:cs="Calibri" w:eastAsia="Microsoft JhengHei" w:hAnsi="Calibri"/>
+                <w:b w:val="false"/>
+                <w:bCs w:val="false"/>
+                <w:sz w:val="19"/>
+                <w:szCs w:val="19"/>
+              </w:rPr>
+              <w:t xml:space="preserve">74.0 / .787</w:t>
+            </w:r>
+          </w:p>
+        </w:tc>
+        <w:tc>
+          <w:tcPr>
+            <w:tcW w:type="dxa" w:w="2150"/>
+            <w:tcBorders>
+              <w:top w:val="single" w:color="BFBFBF" w:sz="4"/>
+              <w:left w:val="single" w:color="BFBFBF" w:sz="4"/>
+              <w:bottom w:val="single" w:color="BFBFBF" w:sz="4"/>
+              <w:right w:val="single" w:color="BFBFBF" w:sz="4"/>
+            </w:tcBorders>
+            <w:tcMar>
+              <w:top w:type="dxa" w:w="25"/>
+              <w:left w:type="dxa" w:w="70"/>
+              <w:bottom w:type="dxa" w:w="25"/>
+              <w:right w:type="dxa" w:w="70"/>
+            </w:tcMar>
+            <w:vAlign w:val="center"/>
+          </w:tcPr>
+          <w:p>
+            <w:pPr>
+              <w:spacing w:after="0" w:before="0" w:line="235"/>
+            </w:pPr>
+            <w:r>
+              <w:rPr>
+                <w:rFonts w:ascii="Calibri" w:cs="Calibri" w:eastAsia="Microsoft JhengHei" w:hAnsi="Calibri"/>
+                <w:b w:val="false"/>
+                <w:bCs w:val="false"/>
+                <w:sz w:val="19"/>
+                <w:szCs w:val="19"/>
+              </w:rPr>
+              <w:t xml:space="preserve">74.3 / .792</w:t>
             </w:r>
           </w:p>
         </w:tc>
@@ -2387,13 +2494,13 @@
                 <w:sz w:val="19"/>
                 <w:szCs w:val="19"/>
               </w:rPr>
-              <w:t xml:space="preserve">0</w:t>
-            </w:r>
-          </w:p>
-        </w:tc>
-        <w:tc>
-          <w:tcPr>
-            <w:tcW w:type="dxa" w:w="1706"/>
+              <w:t xml:space="preserve">−1.1～−3.5</w:t>
+            </w:r>
+          </w:p>
+        </w:tc>
+        <w:tc>
+          <w:tcPr>
+            <w:tcW w:type="dxa" w:w="1806"/>
             <w:tcBorders>
               <w:top w:val="single" w:color="BFBFBF" w:sz="4"/>
               <w:left w:val="single" w:color="BFBFBF" w:sz="4"/>
@@ -2459,13 +2566,13 @@
                 <w:sz w:val="19"/>
                 <w:szCs w:val="19"/>
               </w:rPr>
-              <w:t xml:space="preserve">Young</w:t>
-            </w:r>
-          </w:p>
-        </w:tc>
-        <w:tc>
-          <w:tcPr>
-            <w:tcW w:type="dxa" w:w="2200"/>
+              <w:t xml:space="preserve">Smiling</w:t>
+            </w:r>
+          </w:p>
+        </w:tc>
+        <w:tc>
+          <w:tcPr>
+            <w:tcW w:type="dxa" w:w="2150"/>
             <w:tcBorders>
               <w:top w:val="single" w:color="BFBFBF" w:sz="4"/>
               <w:left w:val="single" w:color="BFBFBF" w:sz="4"/>
@@ -2493,13 +2600,13 @@
                 <w:sz w:val="19"/>
                 <w:szCs w:val="19"/>
               </w:rPr>
-              <w:t xml:space="preserve">66.4 / .788</w:t>
-            </w:r>
-          </w:p>
-        </w:tc>
-        <w:tc>
-          <w:tcPr>
-            <w:tcW w:type="dxa" w:w="2200"/>
+              <w:t xml:space="preserve">93.5 / .883</w:t>
+            </w:r>
+          </w:p>
+        </w:tc>
+        <w:tc>
+          <w:tcPr>
+            <w:tcW w:type="dxa" w:w="2150"/>
             <w:tcBorders>
               <w:top w:val="single" w:color="BFBFBF" w:sz="4"/>
               <w:left w:val="single" w:color="BFBFBF" w:sz="4"/>
@@ -2527,7 +2634,7 @@
                 <w:sz w:val="19"/>
                 <w:szCs w:val="19"/>
               </w:rPr>
-              <w:t xml:space="preserve">77.1 / .776</w:t>
+              <w:t xml:space="preserve">94.2 / .888</w:t>
             </w:r>
           </w:p>
         </w:tc>
@@ -2561,13 +2668,13 @@
                 <w:sz w:val="19"/>
                 <w:szCs w:val="19"/>
               </w:rPr>
-              <w:t xml:space="preserve">約 −6.7</w:t>
-            </w:r>
-          </w:p>
-        </w:tc>
-        <w:tc>
-          <w:tcPr>
-            <w:tcW w:type="dxa" w:w="1706"/>
+              <w:t xml:space="preserve">−0.5～−1.5</w:t>
+            </w:r>
+          </w:p>
+        </w:tc>
+        <w:tc>
+          <w:tcPr>
+            <w:tcW w:type="dxa" w:w="1806"/>
             <w:tcBorders>
               <w:top w:val="single" w:color="BFBFBF" w:sz="4"/>
               <w:left w:val="single" w:color="BFBFBF" w:sz="4"/>
@@ -2595,7 +2702,7 @@
                 <w:sz w:val="19"/>
                 <w:szCs w:val="19"/>
               </w:rPr>
-              <w:t xml:space="preserve">有跡象，不顯著</w:t>
+              <w:t xml:space="preserve">打平</w:t>
             </w:r>
           </w:p>
         </w:tc>
@@ -2639,67 +2746,67 @@
         </w:tc>
         <w:tc>
           <w:tcPr>
-            <w:tcW w:type="dxa" w:w="2200"/>
-            <w:tcBorders>
-              <w:top w:val="single" w:color="BFBFBF" w:sz="4"/>
-              <w:left w:val="single" w:color="BFBFBF" w:sz="4"/>
-              <w:bottom w:val="single" w:color="BFBFBF" w:sz="4"/>
-              <w:right w:val="single" w:color="BFBFBF" w:sz="4"/>
-            </w:tcBorders>
-            <w:tcMar>
-              <w:top w:type="dxa" w:w="25"/>
-              <w:left w:type="dxa" w:w="70"/>
-              <w:bottom w:type="dxa" w:w="25"/>
-              <w:right w:type="dxa" w:w="70"/>
-            </w:tcMar>
-            <w:vAlign w:val="center"/>
-          </w:tcPr>
-          <w:p>
-            <w:pPr>
-              <w:spacing w:after="0" w:before="0" w:line="235"/>
-            </w:pPr>
-            <w:r>
-              <w:rPr>
-                <w:rFonts w:ascii="Calibri" w:cs="Calibri" w:eastAsia="Microsoft JhengHei" w:hAnsi="Calibri"/>
-                <w:b w:val="false"/>
-                <w:bCs w:val="false"/>
-                <w:sz w:val="19"/>
-                <w:szCs w:val="19"/>
-              </w:rPr>
-              <w:t xml:space="preserve">47.4 / .856</w:t>
-            </w:r>
-          </w:p>
-        </w:tc>
-        <w:tc>
-          <w:tcPr>
-            <w:tcW w:type="dxa" w:w="2200"/>
-            <w:tcBorders>
-              <w:top w:val="single" w:color="BFBFBF" w:sz="4"/>
-              <w:left w:val="single" w:color="BFBFBF" w:sz="4"/>
-              <w:bottom w:val="single" w:color="BFBFBF" w:sz="4"/>
-              <w:right w:val="single" w:color="BFBFBF" w:sz="4"/>
-            </w:tcBorders>
-            <w:tcMar>
-              <w:top w:type="dxa" w:w="25"/>
-              <w:left w:type="dxa" w:w="70"/>
-              <w:bottom w:type="dxa" w:w="25"/>
-              <w:right w:type="dxa" w:w="70"/>
-            </w:tcMar>
-            <w:vAlign w:val="center"/>
-          </w:tcPr>
-          <w:p>
-            <w:pPr>
-              <w:spacing w:after="0" w:before="0" w:line="235"/>
-            </w:pPr>
-            <w:r>
-              <w:rPr>
-                <w:rFonts w:ascii="Calibri" w:cs="Calibri" w:eastAsia="Microsoft JhengHei" w:hAnsi="Calibri"/>
-                <w:b w:val="false"/>
-                <w:bCs w:val="false"/>
-                <w:sz w:val="19"/>
-                <w:szCs w:val="19"/>
-              </w:rPr>
-              <w:t xml:space="preserve">51.8 / .861</w:t>
+            <w:tcW w:type="dxa" w:w="2150"/>
+            <w:tcBorders>
+              <w:top w:val="single" w:color="BFBFBF" w:sz="4"/>
+              <w:left w:val="single" w:color="BFBFBF" w:sz="4"/>
+              <w:bottom w:val="single" w:color="BFBFBF" w:sz="4"/>
+              <w:right w:val="single" w:color="BFBFBF" w:sz="4"/>
+            </w:tcBorders>
+            <w:tcMar>
+              <w:top w:type="dxa" w:w="25"/>
+              <w:left w:type="dxa" w:w="70"/>
+              <w:bottom w:type="dxa" w:w="25"/>
+              <w:right w:type="dxa" w:w="70"/>
+            </w:tcMar>
+            <w:vAlign w:val="center"/>
+          </w:tcPr>
+          <w:p>
+            <w:pPr>
+              <w:spacing w:after="0" w:before="0" w:line="235"/>
+            </w:pPr>
+            <w:r>
+              <w:rPr>
+                <w:rFonts w:ascii="Calibri" w:cs="Calibri" w:eastAsia="Microsoft JhengHei" w:hAnsi="Calibri"/>
+                <w:b w:val="false"/>
+                <w:bCs w:val="false"/>
+                <w:sz w:val="19"/>
+                <w:szCs w:val="19"/>
+              </w:rPr>
+              <w:t xml:space="preserve">50.4 / .867</w:t>
+            </w:r>
+          </w:p>
+        </w:tc>
+        <w:tc>
+          <w:tcPr>
+            <w:tcW w:type="dxa" w:w="2150"/>
+            <w:tcBorders>
+              <w:top w:val="single" w:color="BFBFBF" w:sz="4"/>
+              <w:left w:val="single" w:color="BFBFBF" w:sz="4"/>
+              <w:bottom w:val="single" w:color="BFBFBF" w:sz="4"/>
+              <w:right w:val="single" w:color="BFBFBF" w:sz="4"/>
+            </w:tcBorders>
+            <w:tcMar>
+              <w:top w:type="dxa" w:w="25"/>
+              <w:left w:type="dxa" w:w="70"/>
+              <w:bottom w:type="dxa" w:w="25"/>
+              <w:right w:type="dxa" w:w="70"/>
+            </w:tcMar>
+            <w:vAlign w:val="center"/>
+          </w:tcPr>
+          <w:p>
+            <w:pPr>
+              <w:spacing w:after="0" w:before="0" w:line="235"/>
+            </w:pPr>
+            <w:r>
+              <w:rPr>
+                <w:rFonts w:ascii="Calibri" w:cs="Calibri" w:eastAsia="Microsoft JhengHei" w:hAnsi="Calibri"/>
+                <w:b w:val="false"/>
+                <w:bCs w:val="false"/>
+                <w:sz w:val="19"/>
+                <w:szCs w:val="19"/>
+              </w:rPr>
+              <w:t xml:space="preserve">48.9 / .870</w:t>
             </w:r>
           </w:p>
         </w:tc>
@@ -2732,40 +2839,40 @@
                 <w:sz w:val="19"/>
                 <w:szCs w:val="19"/>
               </w:rPr>
-              <w:t xml:space="preserve">約 −6.6</w:t>
-            </w:r>
-          </w:p>
-        </w:tc>
-        <w:tc>
-          <w:tcPr>
-            <w:tcW w:type="dxa" w:w="1706"/>
-            <w:tcBorders>
-              <w:top w:val="single" w:color="BFBFBF" w:sz="4"/>
-              <w:left w:val="single" w:color="BFBFBF" w:sz="4"/>
-              <w:bottom w:val="single" w:color="BFBFBF" w:sz="4"/>
-              <w:right w:val="single" w:color="BFBFBF" w:sz="4"/>
-            </w:tcBorders>
-            <w:tcMar>
-              <w:top w:type="dxa" w:w="25"/>
-              <w:left w:type="dxa" w:w="70"/>
-              <w:bottom w:type="dxa" w:w="25"/>
-              <w:right w:type="dxa" w:w="70"/>
-            </w:tcMar>
-            <w:vAlign w:val="center"/>
-          </w:tcPr>
-          <w:p>
-            <w:pPr>
-              <w:spacing w:after="0" w:before="0" w:line="235"/>
-            </w:pPr>
-            <w:r>
-              <w:rPr>
-                <w:rFonts w:ascii="Calibri" w:cs="Calibri" w:eastAsia="Microsoft JhengHei" w:hAnsi="Calibri"/>
-                <w:b w:val="false"/>
-                <w:bCs w:val="false"/>
-                <w:sz w:val="19"/>
-                <w:szCs w:val="19"/>
-              </w:rPr>
-              <w:t xml:space="preserve">有跡象，不顯著</w:t>
+              <w:t xml:space="preserve">+0.3～+1.6</w:t>
+            </w:r>
+          </w:p>
+        </w:tc>
+        <w:tc>
+          <w:tcPr>
+            <w:tcW w:type="dxa" w:w="1806"/>
+            <w:tcBorders>
+              <w:top w:val="single" w:color="BFBFBF" w:sz="4"/>
+              <w:left w:val="single" w:color="BFBFBF" w:sz="4"/>
+              <w:bottom w:val="single" w:color="BFBFBF" w:sz="4"/>
+              <w:right w:val="single" w:color="BFBFBF" w:sz="4"/>
+            </w:tcBorders>
+            <w:tcMar>
+              <w:top w:type="dxa" w:w="25"/>
+              <w:left w:type="dxa" w:w="70"/>
+              <w:bottom w:type="dxa" w:w="25"/>
+              <w:right w:type="dxa" w:w="70"/>
+            </w:tcMar>
+            <w:vAlign w:val="center"/>
+          </w:tcPr>
+          <w:p>
+            <w:pPr>
+              <w:spacing w:after="0" w:before="0" w:line="235"/>
+            </w:pPr>
+            <w:r>
+              <w:rPr>
+                <w:rFonts w:ascii="Calibri" w:cs="Calibri" w:eastAsia="Microsoft JhengHei" w:hAnsi="Calibri"/>
+                <w:b w:val="false"/>
+                <w:bCs w:val="false"/>
+                <w:sz w:val="19"/>
+                <w:szCs w:val="19"/>
+              </w:rPr>
+              <w:t xml:space="preserve">打平</w:t>
             </w:r>
           </w:p>
         </w:tc>
@@ -2810,7 +2917,7 @@
         </w:tc>
         <w:tc>
           <w:tcPr>
-            <w:tcW w:type="dxa" w:w="2200"/>
+            <w:tcW w:type="dxa" w:w="2150"/>
             <w:tcBorders>
               <w:top w:val="single" w:color="BFBFBF" w:sz="4"/>
               <w:left w:val="single" w:color="BFBFBF" w:sz="4"/>
@@ -2838,13 +2945,13 @@
                 <w:sz w:val="19"/>
                 <w:szCs w:val="19"/>
               </w:rPr>
-              <w:t xml:space="preserve">76.5 / .834</w:t>
-            </w:r>
-          </w:p>
-        </w:tc>
-        <w:tc>
-          <w:tcPr>
-            <w:tcW w:type="dxa" w:w="2200"/>
+              <w:t xml:space="preserve">77.8 / .837</w:t>
+            </w:r>
+          </w:p>
+        </w:tc>
+        <w:tc>
+          <w:tcPr>
+            <w:tcW w:type="dxa" w:w="2150"/>
             <w:tcBorders>
               <w:top w:val="single" w:color="BFBFBF" w:sz="4"/>
               <w:left w:val="single" w:color="BFBFBF" w:sz="4"/>
@@ -2872,7 +2979,7 @@
                 <w:sz w:val="19"/>
                 <w:szCs w:val="19"/>
               </w:rPr>
-              <w:t xml:space="preserve">79.1 / .831</w:t>
+              <w:t xml:space="preserve">78.9 / .835</w:t>
             </w:r>
           </w:p>
         </w:tc>
@@ -2906,13 +3013,13 @@
                 <w:sz w:val="19"/>
                 <w:szCs w:val="19"/>
               </w:rPr>
-              <w:t xml:space="preserve">約 −1.4</w:t>
-            </w:r>
-          </w:p>
-        </w:tc>
-        <w:tc>
-          <w:tcPr>
-            <w:tcW w:type="dxa" w:w="1706"/>
+              <w:t xml:space="preserve">−0.9～+1.7</w:t>
+            </w:r>
+          </w:p>
+        </w:tc>
+        <w:tc>
+          <w:tcPr>
+            <w:tcW w:type="dxa" w:w="1806"/>
             <w:tcBorders>
               <w:top w:val="single" w:color="BFBFBF" w:sz="4"/>
               <w:left w:val="single" w:color="BFBFBF" w:sz="4"/>
@@ -2940,7 +3047,7 @@
                 <w:sz w:val="19"/>
                 <w:szCs w:val="19"/>
               </w:rPr>
-              <w:t xml:space="preserve">FID 24.16 對 23.16</w:t>
+              <w:t xml:space="preserve">打平</w:t>
             </w:r>
           </w:p>
         </w:tc>
@@ -2953,11 +3060,22 @@
       <w:r>
         <w:rPr>
           <w:rFonts w:ascii="Calibri" w:cs="Calibri" w:eastAsia="Microsoft JhengHei" w:hAnsi="Calibri"/>
+          <w:b/>
+          <w:bCs/>
           <w:color w:val="595959"/>
           <w:sz w:val="18"/>
           <w:szCs w:val="18"/>
         </w:rPr>
-        <w:t xml:space="preserve">單一屬性在共識篩選後只有約 110–420 張，誤差約 ±4–5 pp。FID 在 200 張臉下偏高，不可與 500 張的 14 左右比較；同設定的 anneal 也是 23.16，畫質沒有差別。</w:t>
+        <w:t xml:space="preserve">代價</w:t>
+      </w:r>
+      <w:r>
+        <w:rPr>
+          <w:rFonts w:ascii="Calibri" w:cs="Calibri" w:eastAsia="Microsoft JhengHei" w:hAnsi="Calibri"/>
+          <w:color w:val="595959"/>
+          <w:sz w:val="18"/>
+          <w:szCs w:val="18"/>
+        </w:rPr>
+        <w:t xml:space="preserve">：FID 在四個 scale 都高 0.6–0.7（0.9 時 14.93 對 14.29），LPIPS 略高，Young 最明顯（0.110 對 0.095）；精簡版的 Young 編輯量也大很多（|dW| 11.95 對 8.12）。70k 時 Young 的約 −7 pp 差距，到 80k 縮小到 −1～−3.5 pp。</w:t>
       </w:r>
     </w:p>
     <w:p>
@@ -3803,6 +3921,131 @@
                 <w:sz w:val="19"/>
                 <w:szCs w:val="19"/>
               </w:rPr>
+              <w:t xml:space="preserve">精簡版重新訓練後，相同 ID 下整體差 −0.9～+1.7 pp</w:t>
+            </w:r>
+          </w:p>
+        </w:tc>
+        <w:tc>
+          <w:tcPr>
+            <w:tcW w:type="dxa" w:w="3600"/>
+            <w:tcBorders>
+              <w:top w:val="single" w:color="BFBFBF" w:sz="4"/>
+              <w:left w:val="single" w:color="BFBFBF" w:sz="4"/>
+              <w:bottom w:val="single" w:color="BFBFBF" w:sz="4"/>
+              <w:right w:val="single" w:color="BFBFBF" w:sz="4"/>
+            </w:tcBorders>
+            <w:shd w:fill="F3F6FA" w:color="auto" w:val="clear"/>
+            <w:tcMar>
+              <w:top w:type="dxa" w:w="25"/>
+              <w:left w:type="dxa" w:w="70"/>
+              <w:bottom w:type="dxa" w:w="25"/>
+              <w:right w:type="dxa" w:w="70"/>
+            </w:tcMar>
+            <w:vAlign w:val="center"/>
+          </w:tcPr>
+          <w:p>
+            <w:pPr>
+              <w:spacing w:after="0" w:before="0" w:line="235"/>
+            </w:pPr>
+            <w:r>
+              <w:rPr>
+                <w:rFonts w:ascii="Calibri" w:cs="Calibri" w:eastAsia="Microsoft JhengHei" w:hAnsi="Calibri"/>
+                <w:b w:val="false"/>
+                <w:bCs w:val="false"/>
+                <w:sz w:val="19"/>
+                <w:szCs w:val="19"/>
+              </w:rPr>
+              <w:t xml:space="preserve">gate、ControlNet、caps </w:t>
+            </w:r>
+            <w:r>
+              <w:rPr>
+                <w:rFonts w:ascii="Calibri" w:cs="Calibri" w:eastAsia="Microsoft JhengHei" w:hAnsi="Calibri"/>
+                <w:b/>
+                <w:bCs/>
+                <w:sz w:val="19"/>
+                <w:szCs w:val="19"/>
+              </w:rPr>
+              <w:t xml:space="preserve">在訓練時也不需要</w:t>
+            </w:r>
+            <w:r>
+              <w:rPr>
+                <w:rFonts w:ascii="Calibri" w:cs="Calibri" w:eastAsia="Microsoft JhengHei" w:hAnsi="Calibri"/>
+                <w:b w:val="false"/>
+                <w:bCs w:val="false"/>
+                <w:sz w:val="19"/>
+                <w:szCs w:val="19"/>
+              </w:rPr>
+              <w:t xml:space="preserve">；代價為 FID 約 +0.7</w:t>
+            </w:r>
+          </w:p>
+        </w:tc>
+      </w:tr>
+      <w:tr>
+        <w:trPr>
+          <w:cantSplit/>
+        </w:trPr>
+        <w:tc>
+          <w:tcPr>
+            <w:tcW w:type="dxa" w:w="2750"/>
+            <w:tcBorders>
+              <w:top w:val="single" w:color="BFBFBF" w:sz="4"/>
+              <w:left w:val="single" w:color="BFBFBF" w:sz="4"/>
+              <w:bottom w:val="single" w:color="BFBFBF" w:sz="4"/>
+              <w:right w:val="single" w:color="BFBFBF" w:sz="4"/>
+            </w:tcBorders>
+            <w:tcMar>
+              <w:top w:type="dxa" w:w="25"/>
+              <w:left w:type="dxa" w:w="70"/>
+              <w:bottom w:type="dxa" w:w="25"/>
+              <w:right w:type="dxa" w:w="70"/>
+            </w:tcMar>
+            <w:vAlign w:val="center"/>
+          </w:tcPr>
+          <w:p>
+            <w:pPr>
+              <w:spacing w:after="0" w:before="0" w:line="235"/>
+            </w:pPr>
+            <w:r>
+              <w:rPr>
+                <w:rFonts w:ascii="Calibri" w:cs="Calibri" w:eastAsia="Microsoft JhengHei" w:hAnsi="Calibri"/>
+                <w:b w:val="false"/>
+                <w:bCs w:val="false"/>
+                <w:sz w:val="19"/>
+                <w:szCs w:val="19"/>
+              </w:rPr>
+              <w:t xml:space="preserve">（新增）</w:t>
+            </w:r>
+          </w:p>
+        </w:tc>
+        <w:tc>
+          <w:tcPr>
+            <w:tcW w:type="dxa" w:w="3856"/>
+            <w:tcBorders>
+              <w:top w:val="single" w:color="BFBFBF" w:sz="4"/>
+              <w:left w:val="single" w:color="BFBFBF" w:sz="4"/>
+              <w:bottom w:val="single" w:color="BFBFBF" w:sz="4"/>
+              <w:right w:val="single" w:color="BFBFBF" w:sz="4"/>
+            </w:tcBorders>
+            <w:tcMar>
+              <w:top w:type="dxa" w:w="25"/>
+              <w:left w:type="dxa" w:w="70"/>
+              <w:bottom w:type="dxa" w:w="25"/>
+              <w:right w:type="dxa" w:w="70"/>
+            </w:tcMar>
+            <w:vAlign w:val="center"/>
+          </w:tcPr>
+          <w:p>
+            <w:pPr>
+              <w:spacing w:after="0" w:before="0" w:line="235"/>
+            </w:pPr>
+            <w:r>
+              <w:rPr>
+                <w:rFonts w:ascii="Calibri" w:cs="Calibri" w:eastAsia="Microsoft JhengHei" w:hAnsi="Calibri"/>
+                <w:b w:val="false"/>
+                <w:bCs w:val="false"/>
+                <w:sz w:val="19"/>
+                <w:szCs w:val="19"/>
+              </w:rPr>
               <w:t xml:space="preserve">相同 ID 下共識 AccBoth +7.8 pp（Young +17.8 pp）</w:t>
             </w:r>
           </w:p>
@@ -3816,7 +4059,6 @@
               <w:bottom w:val="single" w:color="BFBFBF" w:sz="4"/>
               <w:right w:val="single" w:color="BFBFBF" w:sz="4"/>
             </w:tcBorders>
-            <w:shd w:fill="F3F6FA" w:color="auto" w:val="clear"/>
             <w:tcMar>
               <w:top w:type="dxa" w:w="25"/>
               <w:left w:type="dxa" w:w="70"/>
@@ -3931,7 +4173,7 @@
           <w:sz w:val="21"/>
           <w:szCs w:val="21"/>
         </w:rPr>
-        <w:t xml:space="preserve">：① 精簡版 80k 以 500 張臉完整 sweep，確認 Young／Bangs 差距；② 抽樣檢查移除瀏海，確認是評審問題；③ 線性方向編輯對照組；④ DOF 消融與 Original SDFlow（flow.py 仍保留原版速度場）；⑤ 第二個 seed。</w:t>
+        <w:t xml:space="preserve">：① DOF 消融與 Original SDFlow（以精簡版的設定訓練；flow.py 仍保留原版速度場）；② 抽樣檢查移除瀏海，確認是評審問題；③ 線性方向編輯對照組；④ 第二個 seed；⑤ 查明精簡版 FID／LPIPS 略高的原因。</w:t>
       </w:r>
     </w:p>
     <w:sectPr>

</xml_diff>